<commit_message>
docs(#1216): align proposal with competition scoring
</commit_message>
<xml_diff>
--- a/outputs/TrustForge_賽前提案報告.docx
+++ b/outputs/TrustForge_賽前提案報告.docx
@@ -887,6 +887,496 @@
         <w:t>一般使用者：在做決策前看見支持證據、反方證據與資訊缺口。</w:t>
       </w:r>
     </w:p>
+    <w:p>
+      <w:pPr>
+        <w:pStyle w:val="Heading2"/>
+      </w:pPr>
+      <w:r>
+        <w:t>以官方評分標準設計產品</w:t>
+      </w:r>
+    </w:p>
+    <w:tbl>
+      <w:tblPr>
+        <w:tblStyle w:val="TableGrid"/>
+        <w:tblW w:type="auto" w:w="0"/>
+        <w:jc w:val="center"/>
+        <w:tblLayout w:type="fixed"/>
+        <w:tblLook w:firstColumn="1" w:firstRow="1" w:lastColumn="0" w:lastRow="0" w:noHBand="0" w:noVBand="1" w:val="04A0"/>
+      </w:tblPr>
+      <w:tblGrid>
+        <w:gridCol w:w="3293"/>
+        <w:gridCol w:w="3293"/>
+        <w:gridCol w:w="3293"/>
+      </w:tblGrid>
+      <w:tr>
+        <w:tc>
+          <w:tcPr>
+            <w:tcW w:type="dxa" w:w="2088"/>
+            <w:shd w:fill="3157C8"/>
+            <w:vAlign w:val="center"/>
+          </w:tcPr>
+          <w:p>
+            <w:pPr>
+              <w:spacing w:after="0"/>
+            </w:pPr>
+            <w:r/>
+            <w:r>
+              <w:rPr>
+                <w:rFonts w:ascii="Microsoft JhengHei" w:hAnsi="Microsoft JhengHei"/>
+                <w:b/>
+                <w:color w:val="FFFFFF"/>
+                <w:sz w:val="18"/>
+              </w:rPr>
+              <w:t>評分項</w:t>
+            </w:r>
+          </w:p>
+        </w:tc>
+        <w:tc>
+          <w:tcPr>
+            <w:tcW w:type="dxa" w:w="1008"/>
+            <w:shd w:fill="3157C8"/>
+            <w:vAlign w:val="center"/>
+          </w:tcPr>
+          <w:p>
+            <w:pPr>
+              <w:spacing w:after="0"/>
+            </w:pPr>
+            <w:r/>
+            <w:r>
+              <w:rPr>
+                <w:rFonts w:ascii="Microsoft JhengHei" w:hAnsi="Microsoft JhengHei"/>
+                <w:b/>
+                <w:color w:val="FFFFFF"/>
+                <w:sz w:val="18"/>
+              </w:rPr>
+              <w:t>權重</w:t>
+            </w:r>
+          </w:p>
+        </w:tc>
+        <w:tc>
+          <w:tcPr>
+            <w:tcW w:type="dxa" w:w="6696"/>
+            <w:shd w:fill="3157C8"/>
+            <w:vAlign w:val="center"/>
+          </w:tcPr>
+          <w:p>
+            <w:pPr>
+              <w:spacing w:after="0"/>
+            </w:pPr>
+            <w:r/>
+            <w:r>
+              <w:rPr>
+                <w:rFonts w:ascii="Microsoft JhengHei" w:hAnsi="Microsoft JhengHei"/>
+                <w:b/>
+                <w:color w:val="FFFFFF"/>
+                <w:sz w:val="18"/>
+              </w:rPr>
+              <w:t>TrustForge 的可驗證特色</w:t>
+            </w:r>
+          </w:p>
+        </w:tc>
+      </w:tr>
+      <w:tr>
+        <w:tc>
+          <w:tcPr>
+            <w:tcW w:type="dxa" w:w="2088"/>
+            <w:vAlign w:val="center"/>
+          </w:tcPr>
+          <w:p>
+            <w:pPr>
+              <w:spacing w:after="0"/>
+            </w:pPr>
+            <w:r/>
+            <w:r>
+              <w:rPr>
+                <w:rFonts w:ascii="Microsoft JhengHei" w:hAnsi="Microsoft JhengHei"/>
+                <w:b w:val="0"/>
+                <w:color w:val="172033"/>
+                <w:sz w:val="18"/>
+              </w:rPr>
+              <w:t>主題切合度</w:t>
+            </w:r>
+          </w:p>
+        </w:tc>
+        <w:tc>
+          <w:tcPr>
+            <w:tcW w:type="dxa" w:w="1008"/>
+            <w:vAlign w:val="center"/>
+          </w:tcPr>
+          <w:p>
+            <w:pPr>
+              <w:spacing w:after="0"/>
+            </w:pPr>
+            <w:r/>
+            <w:r>
+              <w:rPr>
+                <w:rFonts w:ascii="Microsoft JhengHei" w:hAnsi="Microsoft JhengHei"/>
+                <w:b w:val="0"/>
+                <w:color w:val="172033"/>
+                <w:sz w:val="18"/>
+              </w:rPr>
+              <w:t>30%</w:t>
+            </w:r>
+          </w:p>
+        </w:tc>
+        <w:tc>
+          <w:tcPr>
+            <w:tcW w:type="dxa" w:w="6696"/>
+            <w:vAlign w:val="center"/>
+          </w:tcPr>
+          <w:p>
+            <w:pPr>
+              <w:spacing w:after="0"/>
+            </w:pPr>
+            <w:r/>
+            <w:r>
+              <w:rPr>
+                <w:rFonts w:ascii="Microsoft JhengHei" w:hAnsi="Microsoft JhengHei"/>
+                <w:b w:val="0"/>
+                <w:color w:val="172033"/>
+                <w:sz w:val="18"/>
+              </w:rPr>
+              <w:t>多源整合、證據回溯、矛盾訊號、雙軸信心與限制說明</w:t>
+            </w:r>
+          </w:p>
+        </w:tc>
+      </w:tr>
+      <w:tr>
+        <w:tc>
+          <w:tcPr>
+            <w:tcW w:type="dxa" w:w="2088"/>
+            <w:shd w:fill="F6F8FC"/>
+            <w:vAlign w:val="center"/>
+          </w:tcPr>
+          <w:p>
+            <w:pPr>
+              <w:spacing w:after="0"/>
+            </w:pPr>
+            <w:r/>
+            <w:r>
+              <w:rPr>
+                <w:rFonts w:ascii="Microsoft JhengHei" w:hAnsi="Microsoft JhengHei"/>
+                <w:b w:val="0"/>
+                <w:color w:val="172033"/>
+                <w:sz w:val="18"/>
+              </w:rPr>
+              <w:t>商業應用性</w:t>
+            </w:r>
+          </w:p>
+        </w:tc>
+        <w:tc>
+          <w:tcPr>
+            <w:tcW w:type="dxa" w:w="1008"/>
+            <w:shd w:fill="F6F8FC"/>
+            <w:vAlign w:val="center"/>
+          </w:tcPr>
+          <w:p>
+            <w:pPr>
+              <w:spacing w:after="0"/>
+            </w:pPr>
+            <w:r/>
+            <w:r>
+              <w:rPr>
+                <w:rFonts w:ascii="Microsoft JhengHei" w:hAnsi="Microsoft JhengHei"/>
+                <w:b w:val="0"/>
+                <w:color w:val="172033"/>
+                <w:sz w:val="18"/>
+              </w:rPr>
+              <w:t>25%</w:t>
+            </w:r>
+          </w:p>
+        </w:tc>
+        <w:tc>
+          <w:tcPr>
+            <w:tcW w:type="dxa" w:w="6696"/>
+            <w:shd w:fill="F6F8FC"/>
+            <w:vAlign w:val="center"/>
+          </w:tcPr>
+          <w:p>
+            <w:pPr>
+              <w:spacing w:after="0"/>
+            </w:pPr>
+            <w:r/>
+            <w:r>
+              <w:rPr>
+                <w:rFonts w:ascii="Microsoft JhengHei" w:hAnsi="Microsoft JhengHei"/>
+                <w:b w:val="0"/>
+                <w:color w:val="172033"/>
+                <w:sz w:val="18"/>
+              </w:rPr>
+              <w:t>降低研究與查核成本；可嵌入 HOYA BIT 市場資訊頁</w:t>
+            </w:r>
+          </w:p>
+        </w:tc>
+      </w:tr>
+      <w:tr>
+        <w:tc>
+          <w:tcPr>
+            <w:tcW w:type="dxa" w:w="2088"/>
+            <w:vAlign w:val="center"/>
+          </w:tcPr>
+          <w:p>
+            <w:pPr>
+              <w:spacing w:after="0"/>
+            </w:pPr>
+            <w:r/>
+            <w:r>
+              <w:rPr>
+                <w:rFonts w:ascii="Microsoft JhengHei" w:hAnsi="Microsoft JhengHei"/>
+                <w:b w:val="0"/>
+                <w:color w:val="172033"/>
+                <w:sz w:val="18"/>
+              </w:rPr>
+              <w:t>技術可行性</w:t>
+            </w:r>
+          </w:p>
+        </w:tc>
+        <w:tc>
+          <w:tcPr>
+            <w:tcW w:type="dxa" w:w="1008"/>
+            <w:vAlign w:val="center"/>
+          </w:tcPr>
+          <w:p>
+            <w:pPr>
+              <w:spacing w:after="0"/>
+            </w:pPr>
+            <w:r/>
+            <w:r>
+              <w:rPr>
+                <w:rFonts w:ascii="Microsoft JhengHei" w:hAnsi="Microsoft JhengHei"/>
+                <w:b w:val="0"/>
+                <w:color w:val="172033"/>
+                <w:sz w:val="18"/>
+              </w:rPr>
+              <w:t>20%</w:t>
+            </w:r>
+          </w:p>
+        </w:tc>
+        <w:tc>
+          <w:tcPr>
+            <w:tcW w:type="dxa" w:w="6696"/>
+            <w:vAlign w:val="center"/>
+          </w:tcPr>
+          <w:p>
+            <w:pPr>
+              <w:spacing w:after="0"/>
+            </w:pPr>
+            <w:r/>
+            <w:r>
+              <w:rPr>
+                <w:rFonts w:ascii="Microsoft JhengHei" w:hAnsi="Microsoft JhengHei"/>
+                <w:b w:val="0"/>
+                <w:color w:val="172033"/>
+                <w:sz w:val="18"/>
+              </w:rPr>
+              <w:t>Trust Kernel、Bedrock 責任分離、獨立降級與執行紀錄</w:t>
+            </w:r>
+          </w:p>
+        </w:tc>
+      </w:tr>
+      <w:tr>
+        <w:tc>
+          <w:tcPr>
+            <w:tcW w:type="dxa" w:w="2088"/>
+            <w:shd w:fill="F6F8FC"/>
+            <w:vAlign w:val="center"/>
+          </w:tcPr>
+          <w:p>
+            <w:pPr>
+              <w:spacing w:after="0"/>
+            </w:pPr>
+            <w:r/>
+            <w:r>
+              <w:rPr>
+                <w:rFonts w:ascii="Microsoft JhengHei" w:hAnsi="Microsoft JhengHei"/>
+                <w:b w:val="0"/>
+                <w:color w:val="172033"/>
+                <w:sz w:val="18"/>
+              </w:rPr>
+              <w:t>創意度</w:t>
+            </w:r>
+          </w:p>
+        </w:tc>
+        <w:tc>
+          <w:tcPr>
+            <w:tcW w:type="dxa" w:w="1008"/>
+            <w:shd w:fill="F6F8FC"/>
+            <w:vAlign w:val="center"/>
+          </w:tcPr>
+          <w:p>
+            <w:pPr>
+              <w:spacing w:after="0"/>
+            </w:pPr>
+            <w:r/>
+            <w:r>
+              <w:rPr>
+                <w:rFonts w:ascii="Microsoft JhengHei" w:hAnsi="Microsoft JhengHei"/>
+                <w:b w:val="0"/>
+                <w:color w:val="172033"/>
+                <w:sz w:val="18"/>
+              </w:rPr>
+              <w:t>15%</w:t>
+            </w:r>
+          </w:p>
+        </w:tc>
+        <w:tc>
+          <w:tcPr>
+            <w:tcW w:type="dxa" w:w="6696"/>
+            <w:shd w:fill="F6F8FC"/>
+            <w:vAlign w:val="center"/>
+          </w:tcPr>
+          <w:p>
+            <w:pPr>
+              <w:spacing w:after="0"/>
+            </w:pPr>
+            <w:r/>
+            <w:r>
+              <w:rPr>
+                <w:rFonts w:ascii="Microsoft JhengHei" w:hAnsi="Microsoft JhengHei"/>
+                <w:b w:val="0"/>
+                <w:color w:val="172033"/>
+                <w:sz w:val="18"/>
+              </w:rPr>
+              <w:t>來源獨立性、矛盾帳本、雙軸信心、負空間情報</w:t>
+            </w:r>
+          </w:p>
+        </w:tc>
+      </w:tr>
+      <w:tr>
+        <w:tc>
+          <w:tcPr>
+            <w:tcW w:type="dxa" w:w="2088"/>
+            <w:vAlign w:val="center"/>
+          </w:tcPr>
+          <w:p>
+            <w:pPr>
+              <w:spacing w:after="0"/>
+            </w:pPr>
+            <w:r/>
+            <w:r>
+              <w:rPr>
+                <w:rFonts w:ascii="Microsoft JhengHei" w:hAnsi="Microsoft JhengHei"/>
+                <w:b w:val="0"/>
+                <w:color w:val="172033"/>
+                <w:sz w:val="18"/>
+              </w:rPr>
+              <w:t>完成度</w:t>
+            </w:r>
+          </w:p>
+        </w:tc>
+        <w:tc>
+          <w:tcPr>
+            <w:tcW w:type="dxa" w:w="1008"/>
+            <w:vAlign w:val="center"/>
+          </w:tcPr>
+          <w:p>
+            <w:pPr>
+              <w:spacing w:after="0"/>
+            </w:pPr>
+            <w:r/>
+            <w:r>
+              <w:rPr>
+                <w:rFonts w:ascii="Microsoft JhengHei" w:hAnsi="Microsoft JhengHei"/>
+                <w:b w:val="0"/>
+                <w:color w:val="172033"/>
+                <w:sz w:val="18"/>
+              </w:rPr>
+              <w:t>10%</w:t>
+            </w:r>
+          </w:p>
+        </w:tc>
+        <w:tc>
+          <w:tcPr>
+            <w:tcW w:type="dxa" w:w="6696"/>
+            <w:vAlign w:val="center"/>
+          </w:tcPr>
+          <w:p>
+            <w:pPr>
+              <w:spacing w:after="0"/>
+            </w:pPr>
+            <w:r/>
+            <w:r>
+              <w:rPr>
+                <w:rFonts w:ascii="Microsoft JhengHei" w:hAnsi="Microsoft JhengHei"/>
+                <w:b w:val="0"/>
+                <w:color w:val="172033"/>
+                <w:sz w:val="18"/>
+              </w:rPr>
+              <w:t>15 分鐘內產出 Report、Evidence、Log 與 Source/Config</w:t>
+            </w:r>
+          </w:p>
+        </w:tc>
+      </w:tr>
+      <w:tr>
+        <w:tc>
+          <w:tcPr>
+            <w:tcW w:type="dxa" w:w="2088"/>
+            <w:shd w:fill="F6F8FC"/>
+            <w:vAlign w:val="center"/>
+          </w:tcPr>
+          <w:p>
+            <w:pPr>
+              <w:spacing w:after="0"/>
+            </w:pPr>
+            <w:r/>
+            <w:r>
+              <w:rPr>
+                <w:rFonts w:ascii="Microsoft JhengHei" w:hAnsi="Microsoft JhengHei"/>
+                <w:b w:val="0"/>
+                <w:color w:val="172033"/>
+                <w:sz w:val="18"/>
+              </w:rPr>
+              <w:t>AWS Kiro</w:t>
+            </w:r>
+          </w:p>
+        </w:tc>
+        <w:tc>
+          <w:tcPr>
+            <w:tcW w:type="dxa" w:w="1008"/>
+            <w:shd w:fill="F6F8FC"/>
+            <w:vAlign w:val="center"/>
+          </w:tcPr>
+          <w:p>
+            <w:pPr>
+              <w:spacing w:after="0"/>
+            </w:pPr>
+            <w:r/>
+            <w:r>
+              <w:rPr>
+                <w:rFonts w:ascii="Microsoft JhengHei" w:hAnsi="Microsoft JhengHei"/>
+                <w:b w:val="0"/>
+                <w:color w:val="172033"/>
+                <w:sz w:val="18"/>
+              </w:rPr>
+              <w:t>+10%</w:t>
+            </w:r>
+          </w:p>
+        </w:tc>
+        <w:tc>
+          <w:tcPr>
+            <w:tcW w:type="dxa" w:w="6696"/>
+            <w:shd w:fill="F6F8FC"/>
+            <w:vAlign w:val="center"/>
+          </w:tcPr>
+          <w:p>
+            <w:pPr>
+              <w:spacing w:after="0"/>
+            </w:pPr>
+            <w:r/>
+            <w:r>
+              <w:rPr>
+                <w:rFonts w:ascii="Microsoft JhengHei" w:hAnsi="Microsoft JhengHei"/>
+                <w:b w:val="0"/>
+                <w:color w:val="172033"/>
+                <w:sz w:val="18"/>
+              </w:rPr>
+              <w:t>Spec 驅動需求、驗收、設計與實作追溯</w:t>
+            </w:r>
+          </w:p>
+        </w:tc>
+      </w:tr>
+    </w:tbl>
+    <w:p/>
     <w:p>
       <w:pPr>
         <w:sectPr>
@@ -2612,6 +3102,41 @@
     </w:p>
     <w:tbl>
       <w:tblPr>
+        <w:tblW w:type="auto" w:w="0"/>
+        <w:jc w:val="center"/>
+        <w:tblLook w:firstColumn="1" w:firstRow="1" w:lastColumn="0" w:lastRow="0" w:noHBand="0" w:noVBand="1" w:val="04A0"/>
+      </w:tblPr>
+      <w:tblGrid>
+        <w:gridCol w:w="9878"/>
+      </w:tblGrid>
+      <w:tr>
+        <w:tc>
+          <w:tcPr>
+            <w:tcW w:type="dxa" w:w="9878"/>
+            <w:shd w:fill="EEF6FF"/>
+            <w:vAlign w:val="center"/>
+          </w:tcPr>
+          <w:p>
+            <w:pPr>
+              <w:spacing w:after="160" w:before="160"/>
+            </w:pPr>
+            <w:r/>
+            <w:r>
+              <w:rPr>
+                <w:rFonts w:ascii="Microsoft JhengHei" w:hAnsi="Microsoft JhengHei"/>
+                <w:b/>
+                <w:color w:val="3157C8"/>
+                <w:sz w:val="22"/>
+              </w:rPr>
+              <w:t>別人給 HOYA BIT 一個答案；TrustForge 讓 HOYA BIT 知道，這個答案值不值得相信。</w:t>
+            </w:r>
+          </w:p>
+        </w:tc>
+      </w:tr>
+    </w:tbl>
+    <w:p/>
+    <w:tbl>
+      <w:tblPr>
         <w:tblStyle w:val="TableGrid"/>
         <w:tblW w:type="auto" w:w="0"/>
         <w:jc w:val="center"/>

</xml_diff>

<commit_message>
docs(#1216): regenerate submission-ready proposal
</commit_message>
<xml_diff>
--- a/outputs/TrustForge_賽前提案報告.docx
+++ b/outputs/TrustForge_賽前提案報告.docx
@@ -12,7 +12,7 @@
           <w:color w:val="21B894"/>
           <w:sz w:val="20"/>
         </w:rPr>
-        <w:t>正式繳交版｜提案大綱＋技術架構＋Demo 與連結</w:t>
+        <w:t>解題方向｜AI 與資料應用｜AWS 架構｜Live Demo</w:t>
       </w:r>
     </w:p>
     <w:p>
@@ -21,7 +21,7 @@
         <w:jc w:val="center"/>
       </w:pPr>
       <w:r>
-        <w:t>TrustForge Hermes 賽前提案報告</w:t>
+        <w:t>TrustForge Hermes 提案報告</w:t>
       </w:r>
     </w:p>
     <w:p>
@@ -470,7 +470,7 @@
         <w:pStyle w:val="Heading1"/>
       </w:pPr>
       <w:r>
-        <w:t>提案大綱（可直接貼到繳交平台）</w:t>
+        <w:t>提案摘要</w:t>
       </w:r>
     </w:p>
     <w:p>
@@ -3547,7 +3547,7 @@
                 <w:color w:val="FFFFFF"/>
                 <w:sz w:val="18"/>
               </w:rPr>
-              <w:t>主辦要求</w:t>
+              <w:t>繳交項目</w:t>
             </w:r>
           </w:p>
         </w:tc>
@@ -3569,7 +3569,7 @@
                 <w:color w:val="FFFFFF"/>
                 <w:sz w:val="18"/>
               </w:rPr>
-              <w:t>提交內容／狀態</w:t>
+              <w:t>內容</w:t>
             </w:r>
           </w:p>
         </w:tc>
@@ -3613,7 +3613,7 @@
                 <w:color w:val="172033"/>
                 <w:sz w:val="18"/>
               </w:rPr>
-              <w:t>已收錄於本文件首頁</w:t>
+              <w:t>參見本文件「團隊基本資料」</w:t>
             </w:r>
           </w:p>
         </w:tc>
@@ -3637,7 +3637,7 @@
                 <w:color w:val="172033"/>
                 <w:sz w:val="18"/>
               </w:rPr>
-              <w:t>提案大綱</w:t>
+              <w:t>提案摘要</w:t>
             </w:r>
           </w:p>
         </w:tc>
@@ -3659,7 +3659,7 @@
                 <w:color w:val="172033"/>
                 <w:sz w:val="18"/>
               </w:rPr>
-              <w:t>已收錄於本文件首頁，可直接貼入平台</w:t>
+              <w:t>參見本文件「提案摘要」</w:t>
             </w:r>
           </w:p>
         </w:tc>
@@ -3703,7 +3703,7 @@
                 <w:color w:val="172033"/>
                 <w:sz w:val="18"/>
               </w:rPr>
-              <w:t>outputs/TrustForge_決賽6分鐘簡報.pptx（提交前再開檔檢查）</w:t>
+              <w:t>TrustForge_決賽6分鐘簡報.pptx</w:t>
             </w:r>
           </w:p>
         </w:tc>
@@ -3793,7 +3793,7 @@
                 <w:color w:val="172033"/>
                 <w:sz w:val="18"/>
               </w:rPr>
-              <w:t>【提交前填入影片網址】</w:t>
+              <w:t>尚待提供正式影片連結</w:t>
             </w:r>
           </w:p>
         </w:tc>

</xml_diff>